<commit_message>
ENH: Revised CFP docs
</commit_message>
<xml_diff>
--- a/docs/Open-H-4D_Call_For_Proposals.docx
+++ b/docs/Open-H-4D_Call_For_Proposals.docx
@@ -579,21 +579,6 @@
         <w:ind w:left="270"/>
       </w:pPr>
       <w:r>
-        <w:t>Ryan Moore, MD</w:t>
-      </w:r>
-      <w:r>
-        <w:tab/>
-      </w:r>
-      <w:r>
-        <w:tab/>
-        <w:t>Cincinnati Children’s Hospital Medical Center</w:t>
-      </w:r>
-    </w:p>
-    <w:p>
-      <w:pPr>
-        <w:ind w:left="270"/>
-      </w:pPr>
-      <w:r>
         <w:t>Jeff Bodner, PhD</w:t>
       </w:r>
       <w:r>
@@ -618,13 +603,8 @@
       <w:pPr>
         <w:ind w:left="270"/>
       </w:pPr>
-      <w:proofErr w:type="spellStart"/>
-      <w:r>
-        <w:t>Xiaoxiao</w:t>
-      </w:r>
-      <w:proofErr w:type="spellEnd"/>
-      <w:r>
-        <w:t xml:space="preserve"> Li, PhD</w:t>
+      <w:r>
+        <w:t>Xiaoxiao Li, PhD</w:t>
       </w:r>
       <w:r>
         <w:tab/>
@@ -648,11 +628,9 @@
       <w:r>
         <w:t xml:space="preserve">The Open-H-4D dataset and model weights will be publicly available on Hugging Face under the </w:t>
       </w:r>
-      <w:proofErr w:type="spellStart"/>
       <w:r>
         <w:t>OpenMDW</w:t>
       </w:r>
-      <w:proofErr w:type="spellEnd"/>
       <w:r>
         <w:t xml:space="preserve"> license.</w:t>
       </w:r>
@@ -934,21 +912,7 @@
         <w:rPr>
           <w:color w:val="000000"/>
         </w:rPr>
-        <w:t xml:space="preserve">– Publish cleaned and pre-processed datasets and model weights under </w:t>
-      </w:r>
-      <w:proofErr w:type="spellStart"/>
-      <w:r>
-        <w:rPr>
-          <w:color w:val="000000"/>
-        </w:rPr>
-        <w:t>OpenMDW</w:t>
-      </w:r>
-      <w:proofErr w:type="spellEnd"/>
-      <w:r>
-        <w:rPr>
-          <w:color w:val="000000"/>
-        </w:rPr>
-        <w:t>, with the first public release targeted for August 2027.</w:t>
+        <w:t>– Publish cleaned and pre-processed datasets and model weights under OpenMDW, with the first public release targeted for August 2027.</w:t>
       </w:r>
     </w:p>
     <w:p>
@@ -2441,21 +2405,7 @@
         <w:rPr>
           <w:color w:val="000000"/>
         </w:rPr>
-        <w:t xml:space="preserve">Confirmation that contributed assets can be publicly released for academic and commercial use under </w:t>
-      </w:r>
-      <w:proofErr w:type="spellStart"/>
-      <w:r>
-        <w:rPr>
-          <w:color w:val="000000"/>
-        </w:rPr>
-        <w:t>OpenMDW</w:t>
-      </w:r>
-      <w:proofErr w:type="spellEnd"/>
-      <w:r>
-        <w:rPr>
-          <w:color w:val="000000"/>
-        </w:rPr>
-        <w:t>. Identify the original data owner and any required third-party permissions, including when a vendor or intermediary supplies the data.</w:t>
+        <w:t>Confirmation that contributed assets can be publicly released for academic and commercial use under OpenMDW. Identify the original data owner and any required third-party permissions, including when a vendor or intermediary supplies the data.</w:t>
       </w:r>
     </w:p>
     <w:p>
@@ -3201,21 +3151,7 @@
         <w:rPr>
           <w:color w:val="000000"/>
         </w:rPr>
-        <w:t xml:space="preserve">Final datasets and model weights will be released under </w:t>
-      </w:r>
-      <w:proofErr w:type="spellStart"/>
-      <w:r>
-        <w:rPr>
-          <w:color w:val="000000"/>
-        </w:rPr>
-        <w:t>OpenMDW</w:t>
-      </w:r>
-      <w:proofErr w:type="spellEnd"/>
-      <w:r>
-        <w:rPr>
-          <w:color w:val="000000"/>
-        </w:rPr>
-        <w:t xml:space="preserve"> (https://openmdw.ai/). Contributors must hold the rights needed to release each contributed asset under that license. This applies to original images, derived models, simulation outputs, and open-category data.</w:t>
+        <w:t>Final datasets and model weights will be released under OpenMDW (https://openmdw.ai/). Contributors must hold the rights needed to release each contributed asset under that license. This applies to original images, derived models, simulation outputs, and open-category data.</w:t>
       </w:r>
     </w:p>
     <w:p/>
@@ -5075,6 +5011,26 @@
 </file>
 
 <file path=customXml/item1.xml><?xml version="1.0" encoding="utf-8"?>
+<p:properties xmlns:p="http://schemas.microsoft.com/office/2006/metadata/properties" xmlns:xsi="http://www.w3.org/2001/XMLSchema-instance" xmlns:pc="http://schemas.microsoft.com/office/infopath/2007/PartnerControls">
+  <documentManagement>
+    <TaxCatchAll xmlns="9dcd8be2-7904-478b-89c2-c68e9f8ab0a6" xsi:nil="true"/>
+    <lcf76f155ced4ddcb4097134ff3c332f xmlns="b90352d6-57f3-4d3b-9d15-34183dbdd5c4">
+      <Terms xmlns="http://schemas.microsoft.com/office/infopath/2007/PartnerControls"/>
+    </lcf76f155ced4ddcb4097134ff3c332f>
+  </documentManagement>
+</p:properties>
+</file>
+
+<file path=customXml/item2.xml><?xml version="1.0" encoding="utf-8"?>
+<?mso-contentType ?>
+<FormTemplates xmlns="http://schemas.microsoft.com/sharepoint/v3/contenttype/forms">
+  <Display>DocumentLibraryForm</Display>
+  <Edit>DocumentLibraryForm</Edit>
+  <New>DocumentLibraryForm</New>
+</FormTemplates>
+</file>
+
+<file path=customXml/item3.xml><?xml version="1.0" encoding="utf-8"?>
 <ct:contentTypeSchema xmlns:ct="http://schemas.microsoft.com/office/2006/metadata/contentType" xmlns:ma="http://schemas.microsoft.com/office/2006/metadata/properties/metaAttributes" ct:_="" ma:_="" ma:contentTypeName="Document" ma:contentTypeID="0x0101000EB08FEA7EAE4F429C9797FE1ADAF48A" ma:contentTypeVersion="14" ma:contentTypeDescription="Create a new document." ma:contentTypeScope="" ma:versionID="d02a83dcbc492c53b2def7a3453be494">
   <xsd:schema xmlns:xsd="http://www.w3.org/2001/XMLSchema" xmlns:xs="http://www.w3.org/2001/XMLSchema" xmlns:p="http://schemas.microsoft.com/office/2006/metadata/properties" xmlns:ns2="b90352d6-57f3-4d3b-9d15-34183dbdd5c4" xmlns:ns3="9dcd8be2-7904-478b-89c2-c68e9f8ab0a6" targetNamespace="http://schemas.microsoft.com/office/2006/metadata/properties" ma:root="true" ma:fieldsID="0418be792f65c0e498c8403d1bdec585" ns2:_="" ns3:_="">
     <xsd:import namespace="b90352d6-57f3-4d3b-9d15-34183dbdd5c4"/>
@@ -5287,26 +5243,6 @@
 </ct:contentTypeSchema>
 </file>
 
-<file path=customXml/item2.xml><?xml version="1.0" encoding="utf-8"?>
-<?mso-contentType ?>
-<FormTemplates xmlns="http://schemas.microsoft.com/sharepoint/v3/contenttype/forms">
-  <Display>DocumentLibraryForm</Display>
-  <Edit>DocumentLibraryForm</Edit>
-  <New>DocumentLibraryForm</New>
-</FormTemplates>
-</file>
-
-<file path=customXml/item3.xml><?xml version="1.0" encoding="utf-8"?>
-<p:properties xmlns:p="http://schemas.microsoft.com/office/2006/metadata/properties" xmlns:xsi="http://www.w3.org/2001/XMLSchema-instance" xmlns:pc="http://schemas.microsoft.com/office/infopath/2007/PartnerControls">
-  <documentManagement>
-    <TaxCatchAll xmlns="9dcd8be2-7904-478b-89c2-c68e9f8ab0a6" xsi:nil="true"/>
-    <lcf76f155ced4ddcb4097134ff3c332f xmlns="b90352d6-57f3-4d3b-9d15-34183dbdd5c4">
-      <Terms xmlns="http://schemas.microsoft.com/office/infopath/2007/PartnerControls"/>
-    </lcf76f155ced4ddcb4097134ff3c332f>
-  </documentManagement>
-</p:properties>
-</file>
-
 <file path=customXml/item4.xml><?xml version="1.0" encoding="utf-8"?>
 <go:gDocsCustomXmlDataStorage xmlns:go="http://customooxmlschemas.google.com/" xmlns:r="http://schemas.openxmlformats.org/officeDocument/2006/relationships" uri="GoogleDocsCustomDataVersion2">
   <go:docsCustomData xmlns:go="http://customooxmlschemas.google.com/" roundtripDataSignature="AMtx7mgzqHtfQa22cgHmdIKC4uU0rWJzVA==">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</go:docsCustomData>
@@ -5314,6 +5250,25 @@
 </file>
 
 <file path=customXml/itemProps1.xml><?xml version="1.0" encoding="utf-8"?>
+<ds:datastoreItem xmlns:ds="http://schemas.openxmlformats.org/officeDocument/2006/customXml" ds:itemID="{82E193AA-1A6F-48AC-A1D1-57719B68D6EB}">
+  <ds:schemaRefs>
+    <ds:schemaRef ds:uri="http://schemas.microsoft.com/office/2006/metadata/properties"/>
+    <ds:schemaRef ds:uri="http://schemas.microsoft.com/office/infopath/2007/PartnerControls"/>
+    <ds:schemaRef ds:uri="9dcd8be2-7904-478b-89c2-c68e9f8ab0a6"/>
+    <ds:schemaRef ds:uri="b90352d6-57f3-4d3b-9d15-34183dbdd5c4"/>
+  </ds:schemaRefs>
+</ds:datastoreItem>
+</file>
+
+<file path=customXml/itemProps2.xml><?xml version="1.0" encoding="utf-8"?>
+<ds:datastoreItem xmlns:ds="http://schemas.openxmlformats.org/officeDocument/2006/customXml" ds:itemID="{2E6622AA-F7C0-46C6-BA20-F508DEC19B89}">
+  <ds:schemaRefs>
+    <ds:schemaRef ds:uri="http://schemas.microsoft.com/sharepoint/v3/contenttype/forms"/>
+  </ds:schemaRefs>
+</ds:datastoreItem>
+</file>
+
+<file path=customXml/itemProps3.xml><?xml version="1.0" encoding="utf-8"?>
 <ds:datastoreItem xmlns:ds="http://schemas.openxmlformats.org/officeDocument/2006/customXml" ds:itemID="{A9DEC529-7E4F-49D8-96D1-5339E661C834}">
   <ds:schemaRefs>
     <ds:schemaRef ds:uri="http://schemas.microsoft.com/office/2006/metadata/contentType"/>
@@ -5332,25 +5287,6 @@
 </ds:datastoreItem>
 </file>
 
-<file path=customXml/itemProps2.xml><?xml version="1.0" encoding="utf-8"?>
-<ds:datastoreItem xmlns:ds="http://schemas.openxmlformats.org/officeDocument/2006/customXml" ds:itemID="{2E6622AA-F7C0-46C6-BA20-F508DEC19B89}">
-  <ds:schemaRefs>
-    <ds:schemaRef ds:uri="http://schemas.microsoft.com/sharepoint/v3/contenttype/forms"/>
-  </ds:schemaRefs>
-</ds:datastoreItem>
-</file>
-
-<file path=customXml/itemProps3.xml><?xml version="1.0" encoding="utf-8"?>
-<ds:datastoreItem xmlns:ds="http://schemas.openxmlformats.org/officeDocument/2006/customXml" ds:itemID="{82E193AA-1A6F-48AC-A1D1-57719B68D6EB}">
-  <ds:schemaRefs>
-    <ds:schemaRef ds:uri="http://schemas.microsoft.com/office/2006/metadata/properties"/>
-    <ds:schemaRef ds:uri="http://schemas.microsoft.com/office/infopath/2007/PartnerControls"/>
-    <ds:schemaRef ds:uri="9dcd8be2-7904-478b-89c2-c68e9f8ab0a6"/>
-    <ds:schemaRef ds:uri="b90352d6-57f3-4d3b-9d15-34183dbdd5c4"/>
-  </ds:schemaRefs>
-</ds:datastoreItem>
-</file>
-
 <file path=customXml/itemProps4.xml><?xml version="1.0" encoding="utf-8"?>
 <ds:datastoreItem xmlns:ds="http://schemas.openxmlformats.org/officeDocument/2006/customXml" ds:itemID="{11111111-1234-1234-1234-123412341234}">
   <ds:schemaRefs>

</xml_diff>